<commit_message>
fix(cv): /dialog correction to infrastructure paragraph (v173->174)
Applied HIC's final wording for the "Työskentelyotteeni on konsultatiivinen"
paragraph: separates sovereign European infrastructure in-house/cloud (NVIDIA
DGX Spark, Upcloud/Aiven, Scaleway, Hetzner) from public-cloud infrastructure
(Azure, Google Cloud, AWS), and adds GitHub-repository-led development
governance. Fixed two typos while applying (Hetzer->Hetzner, double-space
compound). Re-rendered .html/.docx.

Co-Authored-By: Claude Sonnet 5 <noreply@anthropic.com>
Claude-Session: https://claude.ai/code/session_018oMfjZa4w895XHhW1RPDdD
</commit_message>
<xml_diff>
--- a/bids/ORK160826/CV_ORK160826_v172.docx
+++ b/bids/ORK160826/CV_ORK160826_v172.docx
@@ -116,7 +116,13 @@
         <w:br/>
       </w:r>
       <w:r>
-        <w:t xml:space="preserve">Työskentelyotteeni on konsultatiivinen: toimin saumattomasti tilaajan työnjohdon alaisuudessa, noudattaen sovittuja prosesseja ja arkkitehtuuriohjeistuksia. Tuon mukanani enterprise-tason ymmärryksen tekoälyagenttien integroinnista, tietoturvasta (GDPR, NIS2, Katakri) ja skaalautuvasta sekä suvereenista pilvi-infrastruktuurista (Azure, Google Cloud, AWS, Scaleway, NVIDIA DGX Spark). Pääarkkitehtina vaativissa ratkaisukokonaisuuksissa yhdistän strategisen suunnittelun, sääntelyvaatimusten hallinnan ja konkreettisen teknisen toteutuksen asiakkaan tarpeiden mukaisesti.</w:t>
+        <w:t xml:space="preserve">Työskentelyotteeni on konsultatiivinen: toimin saumattomasti tilaajan työnjohdon alaisuudessa, noudattaen sovittuja prosesseja ja arkkitehtuuriohjeistuksia. Tuon mukanani enterprise-tason ymmärryksen tekoälyagenttien integroinnista, tietoturvasta (GDPR, NIS2, Katakri) ja skaalautuvasta sekä suvereenista eurooppalaisesta infrastruktuurista in-house / pilvessä (NVIDIA DGX Spark, Upcloud/Aiven, Scaleway, Hetzner) sekä julkipilvi-infrastruktuureista (Microsoft Azure, Google Cloud, AWS) sekä näiden hankkeiden kehitystyön johtamisesta GitHub-repositoryn kautta.</w:t>
+      </w:r>
+      <w:r>
+        <w:br/>
+      </w:r>
+      <w:r>
+        <w:t xml:space="preserve">Pääarkkitehtina vaativissa ratkaisukokonaisuuksissa yhdistän strategisen suunnittelun, sääntelyvaatimusten hallinnan ja konkreettisen teknisen toteutuksen asiakkaan tarpeiden mukaisesti.</w:t>
       </w:r>
       <w:r>
         <w:br/>
@@ -14835,7 +14841,7 @@
         <w:pStyle w:val="FirstParagraph"/>
       </w:pPr>
       <w:r>
-        <w:t xml:space="preserve">Version: 173</w:t>
+        <w:t xml:space="preserve">Version: 174</w:t>
       </w:r>
     </w:p>
     <w:p>
@@ -14844,6 +14850,102 @@
       </w:pPr>
       <w:r>
         <w:t xml:space="preserve">Sessions &amp; Modifications:</w:t>
+      </w:r>
+    </w:p>
+    <w:p>
+      <w:pPr>
+        <w:numPr>
+          <w:ilvl w:val="0"/>
+          <w:numId w:val="1016"/>
+        </w:numPr>
+        <w:pStyle w:val="Compact"/>
+      </w:pPr>
+      <w:r>
+        <w:t xml:space="preserve">Version: 174 | Tool: Claude Code (Sonnet 5) | Session: claude/cv-senior-ai-engineer-msjheo | Date: 14.07.2026 | Changes: /dialog-korjaus, HIC:n antama lopullinen sanamuoto sovellettu suoraan johdantokappaleen 2. virkkeeseen (</w:t>
+      </w:r>
+      <w:r>
+        <w:t xml:space="preserve">“</w:t>
+      </w:r>
+      <w:r>
+        <w:t xml:space="preserve">Työskentelyotteeni on konsultatiivinen…</w:t>
+      </w:r>
+      <w:r>
+        <w:t xml:space="preserve">”</w:t>
+      </w:r>
+      <w:r>
+        <w:t xml:space="preserve">): pilvi-infrastruktuurikuvaus laajennettu erottelemaan suvereeni eurooppalainen infrastruktuuri in-house/pilvessä (NVIDIA DGX Spark, Upcloud/Aiven, Scaleway, Hetzner) julkipilvi-infrastruktuurista (Microsoft Azure, Google Cloud, AWS); lisätty maininta kehitystyön johtamisesta GitHub-repositoryn kautta. Pieni typo-korjaus HIC:n tekstiin sovellettaessa:</w:t>
+      </w:r>
+      <w:r>
+        <w:t xml:space="preserve"> </w:t>
+      </w:r>
+      <w:r>
+        <w:t xml:space="preserve">“</w:t>
+      </w:r>
+      <w:r>
+        <w:t xml:space="preserve">Hetzer</w:t>
+      </w:r>
+      <w:r>
+        <w:t xml:space="preserve">”</w:t>
+      </w:r>
+      <w:r>
+        <w:t xml:space="preserve"> </w:t>
+      </w:r>
+      <w:r>
+        <w:t xml:space="preserve">→</w:t>
+      </w:r>
+      <w:r>
+        <w:t xml:space="preserve"> </w:t>
+      </w:r>
+      <w:r>
+        <w:t xml:space="preserve">“</w:t>
+      </w:r>
+      <w:r>
+        <w:t xml:space="preserve">Hetzner</w:t>
+      </w:r>
+      <w:r>
+        <w:t xml:space="preserve">”</w:t>
+      </w:r>
+      <w:r>
+        <w:t xml:space="preserve"> </w:t>
+      </w:r>
+      <w:r>
+        <w:t xml:space="preserve">(oikea yhtiönnimi), kaksoisvälilyönti</w:t>
+      </w:r>
+      <w:r>
+        <w:t xml:space="preserve"> </w:t>
+      </w:r>
+      <w:r>
+        <w:t xml:space="preserve">“</w:t>
+      </w:r>
+      <w:r>
+        <w:t xml:space="preserve">julkipilvi -infrastruktuureista</w:t>
+      </w:r>
+      <w:r>
+        <w:t xml:space="preserve">”</w:t>
+      </w:r>
+      <w:r>
+        <w:t xml:space="preserve"> </w:t>
+      </w:r>
+      <w:r>
+        <w:t xml:space="preserve">→</w:t>
+      </w:r>
+      <w:r>
+        <w:t xml:space="preserve"> </w:t>
+      </w:r>
+      <w:r>
+        <w:t xml:space="preserve">“</w:t>
+      </w:r>
+      <w:r>
+        <w:t xml:space="preserve">julkipilvi-infrastruktuureista</w:t>
+      </w:r>
+      <w:r>
+        <w:t xml:space="preserve">”</w:t>
+      </w:r>
+      <w:r>
+        <w:t xml:space="preserve"> </w:t>
+      </w:r>
+      <w:r>
+        <w:t xml:space="preserve">(yhdyssana). Tiedosto 173→174.</w:t>
       </w:r>
     </w:p>
     <w:p>

</xml_diff>

<commit_message>
fix(cv): correct handbook name Konsultin -> Konsultoinnin kasikirja (v175->176)
HIC caught a naming error: the CV (and my own v175 changelog entry) used
"Konsultin kasikirja" (consultant's handbook), but the document's own
canonical title (docs/KONSULTIN_KASIKIRJA_2026.md line 1) is "Konsultoinnin
kasikirja 2026" (consulting handbook) -- the filename's genitive doesn't
match the in-document title. Fixed all 5 occurrences. Re-rendered .html/.docx.

Co-Authored-By: Claude Sonnet 5 <noreply@anthropic.com>
Claude-Session: https://claude.ai/code/session_018oMfjZa4w895XHhW1RPDdD
</commit_message>
<xml_diff>
--- a/bids/ORK160826/CV_ORK160826_v172.docx
+++ b/bids/ORK160826/CV_ORK160826_v172.docx
@@ -5380,7 +5380,7 @@
               <w:jc w:val="left"/>
             </w:pPr>
             <w:r>
-              <w:t xml:space="preserve">Lifetime Scope Journal (LSJ) YouTube/LinkedIn/Blog; domainit lifetime.fi, dws10.com, onelifetime.world, finlandiaseniors.eu, torreviejas.eu, lifetimeconsulting.com; Konsultin käsikirja (Lifetime Oy:n sisäinen opas); WhatsApp Business -kanava wa.me/358400319010; Lifetime World &amp; DWS IQ -projektit (Microsoft Azure); GitHub Projects -teknologiaroadmap, cap table &amp; fundraising; DWS IQ -roadmap: Microsoft Azure, .NET, AI Foundation models, AI Developer tools, Google Firebase Studio; CRM, Prompt Flow Automation</w:t>
+              <w:t xml:space="preserve">Lifetime Scope Journal (LSJ) YouTube/LinkedIn/Blog; domainit lifetime.fi, dws10.com, onelifetime.world, finlandiaseniors.eu, torreviejas.eu, lifetimeconsulting.com; Konsultoinnin käsikirja (Lifetime Oy:n sisäinen opas); WhatsApp Business -kanava wa.me/358400319010; Lifetime World &amp; DWS IQ -projektit (Microsoft Azure); GitHub Projects -teknologiaroadmap, cap table &amp; fundraising; DWS IQ -roadmap: Microsoft Azure, .NET, AI Foundation models, AI Developer tools, Google Firebase Studio; CRM, Prompt Flow Automation</w:t>
             </w:r>
           </w:p>
         </w:tc>
@@ -13788,7 +13788,7 @@
         <w:t xml:space="preserve"> </w:t>
       </w:r>
       <w:r>
-        <w:t xml:space="preserve">-verbilista (248 geneeristä toimintaverbiä: achieving, administering, analyzing…) on sama esi-agentti-kerros, jonka DWS:n kyvykkyysmalli (§6, Konsultin käsikirja) on jo kertaalleen muuntanut:</w:t>
+        <w:t xml:space="preserve">-verbilista (248 geneeristä toimintaverbiä: achieving, administering, analyzing…) on sama esi-agentti-kerros, jonka DWS:n kyvykkyysmalli (§6, Konsultoinnin käsikirja) on jo kertaalleen muuntanut:</w:t>
       </w:r>
       <w:r>
         <w:t xml:space="preserve"> </w:t>
@@ -14065,7 +14065,7 @@
               <w:jc w:val="left"/>
             </w:pPr>
             <w:r>
-              <w:t xml:space="preserve">Konsultin käsikirja, Pilari 1 (koulutamme teidät)</w:t>
+              <w:t xml:space="preserve">Konsultoinnin käsikirja, Pilari 1 (koulutamme teidät)</w:t>
             </w:r>
           </w:p>
         </w:tc>
@@ -14368,7 +14368,7 @@
         <w:t xml:space="preserve"> </w:t>
       </w:r>
       <w:r>
-        <w:t xml:space="preserve">Katalogi kasvaa jatkuvasti uusien sääntelyvaatimusten ja toimialojen myötä. Alla kyvykkyysontologian 10 luokkaa ja 80 nimettyä agenttikyvykkyyttä (lähde: Konsultin käsikirja 2026, §6 Kyvykkyysmalli).</w:t>
+        <w:t xml:space="preserve">Katalogi kasvaa jatkuvasti uusien sääntelyvaatimusten ja toimialojen myötä. Alla kyvykkyysontologian 10 luokkaa ja 80 nimettyä agenttikyvykkyyttä (lähde: Konsultoinnin käsikirja 2026, §6 Kyvykkyysmalli).</w:t>
       </w:r>
     </w:p>
     <w:bookmarkStart w:id="60" w:name="kyvykkyysluokat-10"/>
@@ -14863,7 +14863,7 @@
         <w:pStyle w:val="FirstParagraph"/>
       </w:pPr>
       <w:r>
-        <w:t xml:space="preserve">Version: 175</w:t>
+        <w:t xml:space="preserve">Version: 176</w:t>
       </w:r>
     </w:p>
     <w:p>
@@ -14883,6 +14883,123 @@
         <w:pStyle w:val="Compact"/>
       </w:pPr>
       <w:r>
+        <w:t xml:space="preserve">Version: 176 | Tool: Claude Code (Sonnet 5) | Session: claude/cv-senior-ai-engineer-msjheo | Date: 14.07.2026 | Changes: HIC korjasi nimeämisvirheen:</w:t>
+      </w:r>
+      <w:r>
+        <w:t xml:space="preserve"> </w:t>
+      </w:r>
+      <w:r>
+        <w:t xml:space="preserve">“</w:t>
+      </w:r>
+      <w:r>
+        <w:t xml:space="preserve">Konsultin käsikirja</w:t>
+      </w:r>
+      <w:r>
+        <w:t xml:space="preserve">”</w:t>
+      </w:r>
+      <w:r>
+        <w:t xml:space="preserve"> </w:t>
+      </w:r>
+      <w:r>
+        <w:t xml:space="preserve">→</w:t>
+      </w:r>
+      <w:r>
+        <w:t xml:space="preserve"> </w:t>
+      </w:r>
+      <w:r>
+        <w:t xml:space="preserve">“</w:t>
+      </w:r>
+      <w:r>
+        <w:t xml:space="preserve">Konsultoinnin käsikirja</w:t>
+      </w:r>
+      <w:r>
+        <w:t xml:space="preserve">”</w:t>
+      </w:r>
+      <w:r>
+        <w:t xml:space="preserve"> </w:t>
+      </w:r>
+      <w:r>
+        <w:t xml:space="preserve">(kanoninen otsikko vahvistettu suoraan lähteestä</w:t>
+      </w:r>
+      <w:r>
+        <w:t xml:space="preserve"> </w:t>
+      </w:r>
+      <w:r>
+        <w:rPr>
+          <w:rStyle w:val="VerbatimChar"/>
+        </w:rPr>
+        <w:t xml:space="preserve">docs/KONSULTIN_KASIKIRJA_2026.md</w:t>
+      </w:r>
+      <w:r>
+        <w:t xml:space="preserve"> </w:t>
+      </w:r>
+      <w:r>
+        <w:t xml:space="preserve">rivi 1:</w:t>
+      </w:r>
+      <w:r>
+        <w:t xml:space="preserve"> </w:t>
+      </w:r>
+      <w:r>
+        <w:t xml:space="preserve">“</w:t>
+      </w:r>
+      <w:r>
+        <w:t xml:space="preserve">Konsultoinnin käsikirja 2026</w:t>
+      </w:r>
+      <w:r>
+        <w:t xml:space="preserve">”</w:t>
+      </w:r>
+      <w:r>
+        <w:t xml:space="preserve"> </w:t>
+      </w:r>
+      <w:r>
+        <w:t xml:space="preserve">— tiedostonimi käyttää genetiiviä</w:t>
+      </w:r>
+      <w:r>
+        <w:t xml:space="preserve"> </w:t>
+      </w:r>
+      <w:r>
+        <w:t xml:space="preserve">“</w:t>
+      </w:r>
+      <w:r>
+        <w:t xml:space="preserve">konsultin</w:t>
+      </w:r>
+      <w:r>
+        <w:t xml:space="preserve">”</w:t>
+      </w:r>
+      <w:r>
+        <w:t xml:space="preserve"> </w:t>
+      </w:r>
+      <w:r>
+        <w:t xml:space="preserve">(konsultti-sanasta), mutta dokumentin oma otsikko käyttää</w:t>
+      </w:r>
+      <w:r>
+        <w:t xml:space="preserve"> </w:t>
+      </w:r>
+      <w:r>
+        <w:t xml:space="preserve">“</w:t>
+      </w:r>
+      <w:r>
+        <w:t xml:space="preserve">konsultoinnin</w:t>
+      </w:r>
+      <w:r>
+        <w:t xml:space="preserve">”</w:t>
+      </w:r>
+      <w:r>
+        <w:t xml:space="preserve"> </w:t>
+      </w:r>
+      <w:r>
+        <w:t xml:space="preserve">(konsultointi-toiminnasta), ja jälkimmäinen on kanoninen). Korjattu 5 esiintymää (rivit 274, 462, 469, 480, sekä oma v175-muutosmerkintä alla). Tiedosto 175→176.</w:t>
+      </w:r>
+    </w:p>
+    <w:p>
+      <w:pPr>
+        <w:numPr>
+          <w:ilvl w:val="0"/>
+          <w:numId w:val="1016"/>
+        </w:numPr>
+        <w:pStyle w:val="Compact"/>
+      </w:pPr>
+      <w:r>
         <w:t xml:space="preserve">Version: 175 | Tool: Claude Code (Sonnet 5) | Session: claude/cv-senior-ai-engineer-msjheo | Date: 14.07.2026 | Changes: /dialog-korjaus — HIC pyysi päivitystä MLOps/LLMOps-riville (</w:t>
       </w:r>
       <w:r>
@@ -14946,7 +15063,7 @@
         <w:t xml:space="preserve"> </w:t>
       </w:r>
       <w:r>
-        <w:t xml:space="preserve">-kanoninen lause (lähde: Konsultin käsikirja 2026 §6, eri taksonomia kuin koodirekisteri) jätetty koskemattomaksi — eri lähde, eri väite, ei osa tätä ristiriitaa. Tiedosto 174→175.</w:t>
+        <w:t xml:space="preserve">-kanoninen lause (lähde: Konsultoinnin käsikirja 2026 §6, eri taksonomia kuin koodirekisteri) jätetty koskemattomaksi — eri lähde, eri väite, ei osa tätä ristiriitaa. Tiedosto 174→175.</w:t>
       </w:r>
     </w:p>
     <w:p>

</xml_diff>